<commit_message>
Add IT-World company logo and embed it in the AVV template
Reuses the established Pharma-Tech droplet badge (same teal/green
gradient, 3D glossy bevel) with an "IT-World" wordmark, since that's
the registered business name behind the Auftragsverarbeiter party.
Added as a standalone icon + lockup PNG, and embedded into the AVV's
Partei (2) section with the company name pre-filled.

Co-Authored-By: Claude Sonnet 5 <noreply@anthropic.com>
Claude-Session: https://claude.ai/code/session_01GBMuWPh1XjBDu51gW9XEHR
</commit_message>
<xml_diff>
--- a/pharma-tech-prototype/export/Pharma-Tech-AVV-Vorlage.docx
+++ b/pharma-tech-prototype/export/Pharma-Tech-AVV-Vorlage.docx
@@ -219,6 +219,51 @@
     </w:p>
     <w:p>
       <w:pPr>
+        <w:spacing w:after="160" w:before="120"/>
+      </w:pPr>
+      <w:r>
+        <w:drawing>
+          <wp:inline distT="0" distB="0" distL="0" distR="0">
+            <wp:extent cx="1676400" cy="409575"/>
+            <wp:effectExtent t="0" r="0" b="0" l="0"/>
+            <wp:docPr id="1" name="" descr="" title=""/>
+            <wp:cNvGraphicFramePr>
+              <a:graphicFrameLocks xmlns:a="http://schemas.openxmlformats.org/drawingml/2006/main" noChangeAspect="1"/>
+            </wp:cNvGraphicFramePr>
+            <a:graphic xmlns:a="http://schemas.openxmlformats.org/drawingml/2006/main">
+              <a:graphicData uri="http://schemas.openxmlformats.org/drawingml/2006/picture">
+                <pic:pic xmlns:pic="http://schemas.openxmlformats.org/drawingml/2006/picture">
+                  <pic:nvPicPr>
+                    <pic:cNvPr id="0" name="" descr=""/>
+                    <pic:cNvPicPr>
+                      <a:picLocks noChangeAspect="1" noChangeArrowheads="1"/>
+                    </pic:cNvPicPr>
+                  </pic:nvPicPr>
+                  <pic:blipFill>
+                    <a:blip r:embed="rId9" cstate="none"/>
+                    <a:srcRect/>
+                    <a:stretch>
+                      <a:fillRect/>
+                    </a:stretch>
+                  </pic:blipFill>
+                  <pic:spPr bwMode="auto">
+                    <a:xfrm>
+                      <a:off x="0" y="0"/>
+                      <a:ext cx="1676400" cy="409575"/>
+                    </a:xfrm>
+                    <a:prstGeom prst="rect">
+                      <a:avLst/>
+                    </a:prstGeom>
+                  </pic:spPr>
+                </pic:pic>
+              </a:graphicData>
+            </a:graphic>
+          </wp:inline>
+        </w:drawing>
+      </w:r>
+    </w:p>
+    <w:p>
+      <w:pPr>
         <w:spacing w:after="160"/>
       </w:pPr>
       <w:r>
@@ -232,7 +277,7 @@
         <w:rPr>
           <w:u w:val="single"/>
         </w:rPr>
-        <w:t xml:space="preserve">              </w:t>
+        <w:t xml:space="preserve">IT-World</w:t>
       </w:r>
     </w:p>
     <w:p>

</xml_diff>

<commit_message>
Remove placeholder IT-World logo, add contact email to AVV
The droplet-based logo wasn't IT-World's actual logo — pulling it
back out rather than leaving an incorrect brand mark on a legal
document. Adds the real contact address (info.it-world@gmx.net) to
the Auftragsverarbeiter block instead. Real logo to follow once
provided.

Co-Authored-By: Claude Sonnet 5 <noreply@anthropic.com>
Claude-Session: https://claude.ai/code/session_01GBMuWPh1XjBDu51gW9XEHR
</commit_message>
<xml_diff>
--- a/pharma-tech-prototype/export/Pharma-Tech-AVV-Vorlage.docx
+++ b/pharma-tech-prototype/export/Pharma-Tech-AVV-Vorlage.docx
@@ -219,51 +219,6 @@
     </w:p>
     <w:p>
       <w:pPr>
-        <w:spacing w:after="160" w:before="120"/>
-      </w:pPr>
-      <w:r>
-        <w:drawing>
-          <wp:inline distT="0" distB="0" distL="0" distR="0">
-            <wp:extent cx="1676400" cy="409575"/>
-            <wp:effectExtent t="0" r="0" b="0" l="0"/>
-            <wp:docPr id="1" name="" descr="" title=""/>
-            <wp:cNvGraphicFramePr>
-              <a:graphicFrameLocks xmlns:a="http://schemas.openxmlformats.org/drawingml/2006/main" noChangeAspect="1"/>
-            </wp:cNvGraphicFramePr>
-            <a:graphic xmlns:a="http://schemas.openxmlformats.org/drawingml/2006/main">
-              <a:graphicData uri="http://schemas.openxmlformats.org/drawingml/2006/picture">
-                <pic:pic xmlns:pic="http://schemas.openxmlformats.org/drawingml/2006/picture">
-                  <pic:nvPicPr>
-                    <pic:cNvPr id="0" name="" descr=""/>
-                    <pic:cNvPicPr>
-                      <a:picLocks noChangeAspect="1" noChangeArrowheads="1"/>
-                    </pic:cNvPicPr>
-                  </pic:nvPicPr>
-                  <pic:blipFill>
-                    <a:blip r:embed="rId9" cstate="none"/>
-                    <a:srcRect/>
-                    <a:stretch>
-                      <a:fillRect/>
-                    </a:stretch>
-                  </pic:blipFill>
-                  <pic:spPr bwMode="auto">
-                    <a:xfrm>
-                      <a:off x="0" y="0"/>
-                      <a:ext cx="1676400" cy="409575"/>
-                    </a:xfrm>
-                    <a:prstGeom prst="rect">
-                      <a:avLst/>
-                    </a:prstGeom>
-                  </pic:spPr>
-                </pic:pic>
-              </a:graphicData>
-            </a:graphic>
-          </wp:inline>
-        </w:drawing>
-      </w:r>
-    </w:p>
-    <w:p>
-      <w:pPr>
         <w:spacing w:after="160"/>
       </w:pPr>
       <w:r>
@@ -332,6 +287,24 @@
           <w:u w:val="single"/>
         </w:rPr>
         <w:t xml:space="preserve">              </w:t>
+      </w:r>
+    </w:p>
+    <w:p>
+      <w:pPr>
+        <w:spacing w:after="160"/>
+      </w:pPr>
+      <w:r>
+        <w:rPr>
+          <w:b/>
+          <w:bCs/>
+        </w:rPr>
+        <w:t xml:space="preserve">E-Mail: </w:t>
+      </w:r>
+      <w:r>
+        <w:rPr>
+          <w:u w:val="single"/>
+        </w:rPr>
+        <w:t xml:space="preserve">info.it-world@gmx.net</w:t>
       </w:r>
     </w:p>
     <w:p>

</xml_diff>

<commit_message>
Save IT-World's real logo as a permanent, repo-wide brand asset
Stored at it-world-brand/logo.png (black/gold 3D globe, "IT-WORLD"
wordmark, "IT Solutions" slogan) — intentionally outside any single
project folder since it's the company's own brand, not a product
brand, so future projects in this repo can reuse it without
re-deriving or re-uploading it. Embedded into the AVV template's
Auftragsverarbeiter section, replacing the earlier placeholder.

Co-Authored-By: Claude Sonnet 5 <noreply@anthropic.com>
Claude-Session: https://claude.ai/code/session_01GBMuWPh1XjBDu51gW9XEHR
</commit_message>
<xml_diff>
--- a/pharma-tech-prototype/export/Pharma-Tech-AVV-Vorlage.docx
+++ b/pharma-tech-prototype/export/Pharma-Tech-AVV-Vorlage.docx
@@ -215,6 +215,51 @@
           <w:bCs/>
         </w:rPr>
         <w:t xml:space="preserve">(2) Auftragsverarbeiter im Sinne des Art. 4 Nr. 8 DSGVO</w:t>
+      </w:r>
+    </w:p>
+    <w:p>
+      <w:pPr>
+        <w:spacing w:after="160" w:before="120"/>
+      </w:pPr>
+      <w:r>
+        <w:drawing>
+          <wp:inline distT="0" distB="0" distL="0" distR="0">
+            <wp:extent cx="857250" cy="857250"/>
+            <wp:effectExtent t="0" r="0" b="0" l="0"/>
+            <wp:docPr id="1" name="" descr="" title=""/>
+            <wp:cNvGraphicFramePr>
+              <a:graphicFrameLocks xmlns:a="http://schemas.openxmlformats.org/drawingml/2006/main" noChangeAspect="1"/>
+            </wp:cNvGraphicFramePr>
+            <a:graphic xmlns:a="http://schemas.openxmlformats.org/drawingml/2006/main">
+              <a:graphicData uri="http://schemas.openxmlformats.org/drawingml/2006/picture">
+                <pic:pic xmlns:pic="http://schemas.openxmlformats.org/drawingml/2006/picture">
+                  <pic:nvPicPr>
+                    <pic:cNvPr id="0" name="" descr=""/>
+                    <pic:cNvPicPr>
+                      <a:picLocks noChangeAspect="1" noChangeArrowheads="1"/>
+                    </pic:cNvPicPr>
+                  </pic:nvPicPr>
+                  <pic:blipFill>
+                    <a:blip r:embed="rId9" cstate="none"/>
+                    <a:srcRect/>
+                    <a:stretch>
+                      <a:fillRect/>
+                    </a:stretch>
+                  </pic:blipFill>
+                  <pic:spPr bwMode="auto">
+                    <a:xfrm>
+                      <a:off x="0" y="0"/>
+                      <a:ext cx="857250" cy="857250"/>
+                    </a:xfrm>
+                    <a:prstGeom prst="rect">
+                      <a:avLst/>
+                    </a:prstGeom>
+                  </pic:spPr>
+                </pic:pic>
+              </a:graphicData>
+            </a:graphic>
+          </wp:inline>
+        </w:drawing>
       </w:r>
     </w:p>
     <w:p>

</xml_diff>